<commit_message>
Loss funkcija kroz etape
</commit_message>
<xml_diff>
--- a/Izvestaj/Predviđanje_performansi_NFL_igrača_putem_mašinskog_učenja_Milan_Jovkić_Uroš_Petrašković.docx
+++ b/Izvestaj/Predviđanje_performansi_NFL_igrača_putem_mašinskog_učenja_Milan_Jovkić_Uroš_Petrašković.docx
@@ -37800,6 +37800,265 @@
         <w:pStyle w:val="Heading2"/>
       </w:pPr>
       <w:r>
+        <w:t xml:space="preserve">Vrednost loss funkcije kroz etape </w:t>
+      </w:r>
+    </w:p>
+    <w:p>
+      <w:pPr>
+        <w:pStyle w:val="BodyText"/>
+        <w:rPr>
+          <w:lang w:val="en-US"/>
+        </w:rPr>
+      </w:pPr>
+      <w:r>
+        <w:rPr>
+          <w:lang w:val="en-US"/>
+        </w:rPr>
+        <w:t xml:space="preserve">Kretanje loss funkcije kroz etape praćeno je isključivo za XGBoost i LightGBM modele. Razlog tome leži u prirodi ovih algoritama, radi se o sekvencijalnim boosting metodama koje u svakoj etapi dodaju novo stablo i minimizuju grešku na preostalim rezidualima, što omogućava praćenje train i test RMSE kroz iteracije. Ostali primenjeni modeli ne poseduju ovu osobinu: linearni modeli (Ridge, Lasso, ElasticNet) imaju zatvoreno analitičko rešenje bez iterativnog treninga, Random Forest gradi stabla nezavisno paralelno (bagging) bez sekvencijalnog učenja, dok kNN uopšte nema fazu treninga u klasičnom smislu. </w:t>
+      </w:r>
+    </w:p>
+    <w:p>
+      <w:pPr>
+        <w:pStyle w:val="BodyText"/>
+        <w:rPr>
+          <w:lang w:val="en-US"/>
+        </w:rPr>
+      </w:pPr>
+      <w:r>
+        <w:rPr>
+          <w:lang w:val="en-US"/>
+        </w:rPr>
+        <w:t xml:space="preserve">Analiza je sprovedena za sve četiri pozicije, a kao reprezentativan primer prikazana je pozicija WR, koja je pokazala najzanimljivije ponašanje. </w:t>
+      </w:r>
+      <w:r>
+        <w:rPr>
+          <w:lang w:val="en-US"/>
+        </w:rPr>
+        <w:fldChar w:fldCharType="begin"/>
+      </w:r>
+      <w:r>
+        <w:rPr>
+          <w:lang w:val="en-US"/>
+        </w:rPr>
+        <w:instrText xml:space="preserve"> REF _Ref226569344 \h </w:instrText>
+      </w:r>
+      <w:r>
+        <w:rPr>
+          <w:lang w:val="en-US"/>
+        </w:rPr>
+      </w:r>
+      <w:r>
+        <w:rPr>
+          <w:lang w:val="en-US"/>
+        </w:rPr>
+        <w:fldChar w:fldCharType="separate"/>
+      </w:r>
+      <w:r>
+        <w:t xml:space="preserve">Slika </w:t>
+      </w:r>
+      <w:r>
+        <w:rPr>
+          <w:noProof/>
+        </w:rPr>
+        <w:t>9</w:t>
+      </w:r>
+      <w:r>
+        <w:rPr>
+          <w:lang w:val="en-US"/>
+        </w:rPr>
+        <w:fldChar w:fldCharType="end"/>
+      </w:r>
+      <w:r>
+        <w:rPr>
+          <w:lang w:val="en-US"/>
+        </w:rPr>
+        <w:t xml:space="preserve"> prikaz</w:t>
+      </w:r>
+      <w:r>
+        <w:rPr>
+          <w:lang w:val="en-US"/>
+        </w:rPr>
+        <w:t>uje</w:t>
+      </w:r>
+      <w:r>
+        <w:rPr>
+          <w:lang w:val="en-US"/>
+        </w:rPr>
+        <w:t xml:space="preserve"> tok loss funkcije za XGBoost i LightGBM na WR poziciji. Može se uočiti blagi underfitting, train i test krive su bliske jedna drugoj i obe nastavljaju da opadaju do kraja posmatranog broja etapa, bez jasnog minimuma test greške, što ukazuje da modeli nisu dostigli svoj optimalni kapacitet. </w:t>
+      </w:r>
+    </w:p>
+    <w:p>
+      <w:pPr>
+        <w:keepNext/>
+      </w:pPr>
+      <w:r>
+        <w:drawing>
+          <wp:inline distT="0" distB="0" distL="0" distR="0" wp14:anchorId="53C6147E" wp14:editId="581F1498">
+            <wp:extent cx="3089910" cy="3321685"/>
+            <wp:effectExtent l="0" t="0" r="0" b="0"/>
+            <wp:docPr id="1755487639" name="Picture 1" descr="A graph of a train and light&#10;&#10;Description automatically generated with medium confidence"/>
+            <wp:cNvGraphicFramePr>
+              <a:graphicFrameLocks xmlns:a="http://purl.oclc.org/ooxml/drawingml/main" noChangeAspect="1"/>
+            </wp:cNvGraphicFramePr>
+            <a:graphic xmlns:a="http://purl.oclc.org/ooxml/drawingml/main">
+              <a:graphicData uri="http://purl.oclc.org/ooxml/drawingml/picture">
+                <pic:pic xmlns:pic="http://purl.oclc.org/ooxml/drawingml/picture">
+                  <pic:nvPicPr>
+                    <pic:cNvPr id="1755487639" name="Picture 1" descr="A graph of a train and light&#10;&#10;Description automatically generated with medium confidence"/>
+                    <pic:cNvPicPr/>
+                  </pic:nvPicPr>
+                  <pic:blipFill>
+                    <a:blip r:embed="rId17"/>
+                    <a:stretch>
+                      <a:fillRect/>
+                    </a:stretch>
+                  </pic:blipFill>
+                  <pic:spPr>
+                    <a:xfrm>
+                      <a:off x="0" y="0"/>
+                      <a:ext cx="3089910" cy="3321685"/>
+                    </a:xfrm>
+                    <a:prstGeom prst="rect">
+                      <a:avLst/>
+                    </a:prstGeom>
+                  </pic:spPr>
+                </pic:pic>
+              </a:graphicData>
+            </a:graphic>
+          </wp:inline>
+        </w:drawing>
+      </w:r>
+    </w:p>
+    <w:p>
+      <w:pPr>
+        <w:pStyle w:val="Caption"/>
+      </w:pPr>
+      <w:bookmarkStart w:id="31" w:name="_Ref226569344"/>
+      <w:r>
+        <w:t xml:space="preserve">Slika </w:t>
+      </w:r>
+      <w:fldSimple w:instr=" SEQ Slika \* ARABIC ">
+        <w:r>
+          <w:rPr>
+            <w:noProof/>
+          </w:rPr>
+          <w:t>9</w:t>
+        </w:r>
+      </w:fldSimple>
+      <w:bookmarkEnd w:id="31"/>
+      <w:r>
+        <w:t xml:space="preserve"> Vrednost loss funkcije kroz etape</w:t>
+      </w:r>
+    </w:p>
+    <w:p>
+      <w:pPr>
+        <w:pStyle w:val="BodyText"/>
+      </w:pPr>
+      <w:r>
+        <w:t xml:space="preserve">Na osnovu ovog uvida, broj boosting etapa je povećan, a uvedeno je i early stopping kako bi se automatski detektovao optimalan trenutak zaustavljanja treninga. Rezultati su prikazani na </w:t>
+      </w:r>
+      <w:r>
+        <w:fldChar w:fldCharType="begin"/>
+      </w:r>
+      <w:r>
+        <w:instrText xml:space="preserve"> REF _Ref226569263 \h </w:instrText>
+      </w:r>
+      <w:r>
+        <w:fldChar w:fldCharType="separate"/>
+      </w:r>
+      <w:r>
+        <w:t>Slik</w:t>
+      </w:r>
+      <w:r>
+        <w:t>a</w:t>
+      </w:r>
+      <w:r>
+        <w:t xml:space="preserve"> </w:t>
+      </w:r>
+      <w:r>
+        <w:rPr>
+          <w:noProof/>
+        </w:rPr>
+        <w:t>10</w:t>
+      </w:r>
+      <w:r>
+        <w:fldChar w:fldCharType="end"/>
+      </w:r>
+      <w:r>
+        <w:t xml:space="preserve">. Može se uočiti da se loss funkcija stabilizovala veoma brzo nakon povećanja broja etapa, a vrednosti greške nisu se značajno promenile u odnosu na prethodni eksperiment. Ovo retroaktivno potvrđuje da je minimum loss funkcije bio blizu kraja prvog eksperimenta, te da inicijalni utisak underfittinga nije bio u potpunosti opravdan. Oba modela pokazuju solidnu konvergenciju uz </w:t>
+      </w:r>
+      <w:r>
+        <w:lastRenderedPageBreak/>
+        <w:t>minimalan gap između train i test greške, što potvrđuje dobru generalizaciju na neviđenim podacima.</w:t>
+      </w:r>
+    </w:p>
+    <w:p>
+      <w:r>
+        <w:drawing>
+          <wp:inline distT="0" distB="0" distL="0" distR="0" wp14:anchorId="29A587CC" wp14:editId="2E5BE552">
+            <wp:extent cx="3089910" cy="3464560"/>
+            <wp:effectExtent l="0" t="0" r="0" b="2540"/>
+            <wp:docPr id="54034766" name="Picture 1"/>
+            <wp:cNvGraphicFramePr>
+              <a:graphicFrameLocks xmlns:a="http://purl.oclc.org/ooxml/drawingml/main" noChangeAspect="1"/>
+            </wp:cNvGraphicFramePr>
+            <a:graphic xmlns:a="http://purl.oclc.org/ooxml/drawingml/main">
+              <a:graphicData uri="http://purl.oclc.org/ooxml/drawingml/picture">
+                <pic:pic xmlns:pic="http://purl.oclc.org/ooxml/drawingml/picture">
+                  <pic:nvPicPr>
+                    <pic:cNvPr id="54034766" name=""/>
+                    <pic:cNvPicPr/>
+                  </pic:nvPicPr>
+                  <pic:blipFill>
+                    <a:blip r:embed="rId18"/>
+                    <a:stretch>
+                      <a:fillRect/>
+                    </a:stretch>
+                  </pic:blipFill>
+                  <pic:spPr>
+                    <a:xfrm>
+                      <a:off x="0" y="0"/>
+                      <a:ext cx="3089910" cy="3464560"/>
+                    </a:xfrm>
+                    <a:prstGeom prst="rect">
+                      <a:avLst/>
+                    </a:prstGeom>
+                  </pic:spPr>
+                </pic:pic>
+              </a:graphicData>
+            </a:graphic>
+          </wp:inline>
+        </w:drawing>
+      </w:r>
+    </w:p>
+    <w:p>
+      <w:pPr>
+        <w:pStyle w:val="Caption"/>
+      </w:pPr>
+      <w:bookmarkStart w:id="32" w:name="_Ref226569253"/>
+      <w:bookmarkStart w:id="33" w:name="_Ref226569263"/>
+      <w:r>
+        <w:t xml:space="preserve">Slika </w:t>
+      </w:r>
+      <w:fldSimple w:instr=" SEQ Slika \* ARABIC ">
+        <w:r>
+          <w:rPr>
+            <w:noProof/>
+          </w:rPr>
+          <w:t>10</w:t>
+        </w:r>
+      </w:fldSimple>
+      <w:bookmarkEnd w:id="33"/>
+      <w:r>
+        <w:t xml:space="preserve"> Vrednost loss funkcije kroz etape nakon dupliranja broja epoha</w:t>
+      </w:r>
+      <w:bookmarkEnd w:id="32"/>
+    </w:p>
+    <w:p>
+      <w:pPr>
+        <w:pStyle w:val="Heading2"/>
+      </w:pPr>
+      <w:r>
         <w:t>Multi output regresija</w:t>
       </w:r>
     </w:p>
@@ -41429,7 +41688,7 @@
       <w:pPr>
         <w:pStyle w:val="Caption"/>
       </w:pPr>
-      <w:bookmarkStart w:id="31" w:name="_Ref225794807"/>
+      <w:bookmarkStart w:id="34" w:name="_Ref225794807"/>
       <w:r>
         <w:t xml:space="preserve">Tabela </w:t>
       </w:r>
@@ -41441,7 +41700,7 @@
           <w:t>22</w:t>
         </w:r>
       </w:fldSimple>
-      <w:bookmarkEnd w:id="31"/>
+      <w:bookmarkEnd w:id="34"/>
       <w:r>
         <w:t xml:space="preserve"> Multi output rezultati za sve pozicije</w:t>
       </w:r>
@@ -41461,11 +41720,7 @@
         <w:t>multi-output</w:t>
       </w:r>
       <w:r>
-        <w:t xml:space="preserve"> regresije za yards_per_game kroz sve pozicije ukazuju na konzistentno slabije performanse u </w:t>
-      </w:r>
-      <w:r>
-        <w:lastRenderedPageBreak/>
-        <w:t xml:space="preserve">poređenju sa </w:t>
+        <w:t xml:space="preserve"> regresije za yards_per_game kroz sve pozicije ukazuju na konzistentno slabije performanse u poređenju sa </w:t>
       </w:r>
       <w:r>
         <w:rPr>
@@ -42606,6 +42861,7 @@
           <w:i/>
           <w:iCs/>
         </w:rPr>
+        <w:lastRenderedPageBreak/>
         <w:t>yac_per_game</w:t>
       </w:r>
       <w:r>
@@ -42803,10 +43059,7 @@
         <w:t>web</w:t>
       </w:r>
       <w:r>
-        <w:t xml:space="preserve"> skrejperom, a za poziciju WR korišćen je i </w:t>
-      </w:r>
-      <w:r>
-        <w:t xml:space="preserve">javno dostupan skup podataka sa </w:t>
+        <w:t xml:space="preserve"> skrejperom, a za poziciju WR korišćen je i javno dostupan skup podataka sa </w:t>
       </w:r>
       <w:r>
         <w:rPr>
@@ -43165,11 +43418,7 @@
         <w:pStyle w:val="BodyText"/>
       </w:pPr>
       <w:r>
-        <w:t xml:space="preserve">Ovaj rad treba pre svega zapamtiti po poziciono specifičnom pristupu modelovanju individualnih performansi NFL igrača, koji demonstrira da različite pozicije zahtevaju različite modelske pristupe, linearne i nelinearne, u zavisnosti </w:t>
-      </w:r>
-      <w:r>
-        <w:lastRenderedPageBreak/>
-        <w:t xml:space="preserve">od statističke strukture podataka. Takodje, primena </w:t>
+        <w:t xml:space="preserve">Ovaj rad treba pre svega zapamtiti po poziciono specifičnom pristupu modelovanju individualnih performansi NFL igrača, koji demonstrira da različite pozicije zahtevaju različite modelske pristupe, linearne i nelinearne, u zavisnosti od statističke strukture podataka. Takodje, primena </w:t>
       </w:r>
       <w:r>
         <w:rPr>
@@ -43297,7 +43546,11 @@
         <w:t>lag</w:t>
       </w:r>
       <w:r>
-        <w:t xml:space="preserve"> pristupa, koji korišćenjem karakteristika iz prethodne jedne ili dve sezone na implicitan način kodira istoriju igrača, LSTM i GRU mogu naučiti složene dugoročne zavisnosti direktno iz sekvence podataka. U kontekstu predviđanja NFL performansi, ove arhitekture bi mogle bolje modelovati koncepte poput forme igrača tokom višegodišnje karijere, opadanja učinka usled starenja ili postepenog rasta mladih igrača.</w:t>
+        <w:t xml:space="preserve"> pristupa, koji korišćenjem karakteristika iz prethodne jedne ili dve sezone na implicitan način kodira istoriju igrača, LSTM i GRU mogu naučiti složene dugoročne zavisnosti direktno iz sekvence podataka. U kontekstu predviđanja NFL performansi, ove arhitekture bi mogle bolje modelovati koncepte poput forme igrača tokom višegodišnje karijere, </w:t>
+      </w:r>
+      <w:r>
+        <w:lastRenderedPageBreak/>
+        <w:t>opadanja učinka usled starenja ili postepenog rasta mladih igrača.</w:t>
       </w:r>
     </w:p>
     <w:p>
@@ -43348,10 +43601,7 @@
         <w:pStyle w:val="BodyText"/>
       </w:pPr>
       <w:r>
-        <w:t xml:space="preserve">Konačno, interesantan otvoreni problem koji je ovo istraživanje otvorilo jeste pitanje optimalne granularnosti predviđanja: da li je bolje graditi posebne modele za svaku </w:t>
-      </w:r>
-      <w:r>
-        <w:t>poziciju (kao što je učinjeno u ovom radu), ili bi još finija segmentacija - na primer razlikovanje startujućih od rezervnih igrača, ili podešavanje modela prema fazi karijere igrača (uspon, zrelost, kraj karijere) - dovela do značajno boljih rezultata. Odgovori na ova pitanja imaju direktnu praktičnu vrednost i predstavljaju prirodni nastavak istraživanja započetog u ovom radu.</w:t>
+        <w:t>Konačno, interesantan otvoreni problem koji je ovo istraživanje otvorilo jeste pitanje optimalne granularnosti predviđanja: da li je bolje graditi posebne modele za svaku poziciju (kao što je učinjeno u ovom radu), ili bi još finija segmentacija - na primer razlikovanje startujućih od rezervnih igrača, ili podešavanje modela prema fazi karijere igrača (uspon, zrelost, kraj karijere) - dovela do značajno boljih rezultata. Odgovori na ova pitanja imaju direktnu praktičnu vrednost i predstavljaju prirodni nastavak istraživanja započetog u ovom radu.</w:t>
       </w:r>
     </w:p>
     <w:p>
@@ -43366,49 +43616,9 @@
       <w:pPr>
         <w:pStyle w:val="references"/>
       </w:pPr>
-      <w:bookmarkStart w:id="32" w:name="_Ref225795821"/>
+      <w:bookmarkStart w:id="35" w:name="_Ref225795821"/>
       <w:r>
         <w:t>Weirich, C., Kim, J.W., Yoon, Y. and Jeong, S., 2025. Advancing NFL win prediction: From Pythagorean formulas to machine learning algorithms. Frontiers in Sports and Active Living, 7, p.1638446.</w:t>
-      </w:r>
-      <w:bookmarkEnd w:id="32"/>
-    </w:p>
-    <w:p>
-      <w:pPr>
-        <w:pStyle w:val="references"/>
-      </w:pPr>
-      <w:bookmarkStart w:id="33" w:name="_Ref225809582"/>
-      <w:r>
-        <w:t>Mondello, M. and Maxcy, J., 2009. The impact of salary dispersion and performance bonuses in NFL organizations. Management Decision, 47(1), pp.110-123.</w:t>
-      </w:r>
-      <w:bookmarkEnd w:id="33"/>
-    </w:p>
-    <w:p>
-      <w:pPr>
-        <w:pStyle w:val="references"/>
-      </w:pPr>
-      <w:bookmarkStart w:id="34" w:name="_Ref225809618"/>
-      <w:r>
-        <w:t>Hyndman, R.J. and Athanasopoulos, G., 2018. </w:t>
-      </w:r>
-      <w:r>
-        <w:rPr>
-          <w:i/>
-          <w:iCs/>
-        </w:rPr>
-        <w:t>Forecasting: principles and practice</w:t>
-      </w:r>
-      <w:r>
-        <w:t>. OTexts.</w:t>
-      </w:r>
-      <w:bookmarkEnd w:id="34"/>
-    </w:p>
-    <w:p>
-      <w:pPr>
-        <w:pStyle w:val="references"/>
-      </w:pPr>
-      <w:bookmarkStart w:id="35" w:name="_Ref225809719"/>
-      <w:r>
-        <w:t>Elimam, R., Sutton-Charani, N., Prioux, J., Montmain, J. and Perrey, S., 2025. Multi-output regression for the prediction of world-class performances in women’s handball. IEEE Access.</w:t>
       </w:r>
       <w:bookmarkEnd w:id="35"/>
     </w:p>
@@ -43416,9 +43626,9 @@
       <w:pPr>
         <w:pStyle w:val="references"/>
       </w:pPr>
-      <w:bookmarkStart w:id="36" w:name="_Ref225809740"/>
-      <w:r>
-        <w:t>Cover, T. and Hart, P., 1967. Nearest neighbor pattern classification. IEEE transactions on information theory, 13(1), pp.21-27.</w:t>
+      <w:bookmarkStart w:id="36" w:name="_Ref225809582"/>
+      <w:r>
+        <w:t>Mondello, M. and Maxcy, J., 2009. The impact of salary dispersion and performance bonuses in NFL organizations. Management Decision, 47(1), pp.110-123.</w:t>
       </w:r>
       <w:bookmarkEnd w:id="36"/>
     </w:p>
@@ -43426,9 +43636,19 @@
       <w:pPr>
         <w:pStyle w:val="references"/>
       </w:pPr>
-      <w:bookmarkStart w:id="37" w:name="_Ref225809751"/>
-      <w:r>
-        <w:t>Breiman, L., 2001. Random forests. Machine learning, 45(1), pp.5-32.</w:t>
+      <w:bookmarkStart w:id="37" w:name="_Ref225809618"/>
+      <w:r>
+        <w:t>Hyndman, R.J. and Athanasopoulos, G., 2018. </w:t>
+      </w:r>
+      <w:r>
+        <w:rPr>
+          <w:i/>
+          <w:iCs/>
+        </w:rPr>
+        <w:t>Forecasting: principles and practice</w:t>
+      </w:r>
+      <w:r>
+        <w:t>. OTexts.</w:t>
       </w:r>
       <w:bookmarkEnd w:id="37"/>
     </w:p>
@@ -43436,15 +43656,45 @@
       <w:pPr>
         <w:pStyle w:val="references"/>
       </w:pPr>
-      <w:r>
-        <w:t>Abadzic, A., Cheun, J. and Patel, M., 2024. Data Analysis on Predicting the Top 12 Fantasy Football Players by Position. SMU Data Science Review, 8(2), p.7.</w:t>
-      </w:r>
+      <w:bookmarkStart w:id="38" w:name="_Ref225809719"/>
+      <w:r>
+        <w:t>Elimam, R., Sutton-Charani, N., Prioux, J., Montmain, J. and Perrey, S., 2025. Multi-output regression for the prediction of world-class performances in women’s handball. IEEE Access.</w:t>
+      </w:r>
+      <w:bookmarkEnd w:id="38"/>
     </w:p>
     <w:p>
       <w:pPr>
         <w:pStyle w:val="references"/>
       </w:pPr>
-      <w:bookmarkStart w:id="38" w:name="_Ref225810081"/>
+      <w:bookmarkStart w:id="39" w:name="_Ref225809740"/>
+      <w:r>
+        <w:t>Cover, T. and Hart, P., 1967. Nearest neighbor pattern classification. IEEE transactions on information theory, 13(1), pp.21-27.</w:t>
+      </w:r>
+      <w:bookmarkEnd w:id="39"/>
+    </w:p>
+    <w:p>
+      <w:pPr>
+        <w:pStyle w:val="references"/>
+      </w:pPr>
+      <w:bookmarkStart w:id="40" w:name="_Ref225809751"/>
+      <w:r>
+        <w:t>Breiman, L., 2001. Random forests. Machine learning, 45(1), pp.5-32.</w:t>
+      </w:r>
+      <w:bookmarkEnd w:id="40"/>
+    </w:p>
+    <w:p>
+      <w:pPr>
+        <w:pStyle w:val="references"/>
+      </w:pPr>
+      <w:r>
+        <w:t>Abadzic, A., Cheun, J. and Patel, M., 2024. Data Analysis on Predicting the Top 12 Fantasy Football Players by Position. SMU Data Science Review, 8(2), p.7.</w:t>
+      </w:r>
+    </w:p>
+    <w:p>
+      <w:pPr>
+        <w:pStyle w:val="references"/>
+      </w:pPr>
+      <w:bookmarkStart w:id="41" w:name="_Ref225810081"/>
       <w:r>
         <w:t>Pro Football Stats, History, Scores, Standings, Playoffs, Schedule &amp; Records</w:t>
       </w:r>
@@ -43457,7 +43707,7 @@
       <w:r>
         <w:t xml:space="preserve">Available: </w:t>
       </w:r>
-      <w:hyperlink r:id="rId17" w:history="1">
+      <w:hyperlink r:id="rId19" w:history="1">
         <w:r>
           <w:rPr>
             <w:rStyle w:val="Hyperlink"/>
@@ -43471,17 +43721,17 @@
       <w:r>
         <w:t>(accessed Mar. 2026).</w:t>
       </w:r>
-      <w:bookmarkEnd w:id="38"/>
+      <w:bookmarkEnd w:id="41"/>
     </w:p>
     <w:p>
       <w:pPr>
         <w:pStyle w:val="references"/>
       </w:pPr>
-      <w:bookmarkStart w:id="39" w:name="_Ref225810099"/>
+      <w:bookmarkStart w:id="42" w:name="_Ref225810099"/>
       <w:r>
         <w:t xml:space="preserve">SeleniumHQ, Selenium WebDriver. [Online]. Available: </w:t>
       </w:r>
-      <w:hyperlink r:id="rId18" w:tgtFrame="_blank" w:tooltip="https://www.selenium.dev/" w:history="1">
+      <w:hyperlink r:id="rId20" w:tgtFrame="_blank" w:tooltip="https://www.selenium.dev/" w:history="1">
         <w:r>
           <w:rPr>
             <w:rStyle w:val="Hyperlink"/>
@@ -43492,17 +43742,17 @@
       <w:r>
         <w:t xml:space="preserve"> (accessed Mar. 2026).</w:t>
       </w:r>
-      <w:bookmarkEnd w:id="39"/>
+      <w:bookmarkEnd w:id="42"/>
     </w:p>
     <w:p>
       <w:pPr>
         <w:pStyle w:val="references"/>
       </w:pPr>
-      <w:bookmarkStart w:id="40" w:name="_Ref225810116"/>
+      <w:bookmarkStart w:id="43" w:name="_Ref225810116"/>
       <w:r>
         <w:t xml:space="preserve">SebastianAndreu, 24679_NFL_WR_Dataset_2025. [Online]. Available: </w:t>
       </w:r>
-      <w:hyperlink r:id="rId19" w:tgtFrame="_blank" w:tooltip="https://huggingface.co/datasets/SebastianAndreu/24679_NFL_WR_Dataset_2025" w:history="1">
+      <w:hyperlink r:id="rId21" w:tgtFrame="_blank" w:tooltip="https://huggingface.co/datasets/SebastianAndreu/24679_NFL_WR_Dataset_2025" w:history="1">
         <w:r>
           <w:rPr>
             <w:rStyle w:val="Hyperlink"/>
@@ -43513,13 +43763,13 @@
       <w:r>
         <w:t xml:space="preserve"> (accessed Mar. 2026).</w:t>
       </w:r>
-      <w:bookmarkEnd w:id="40"/>
+      <w:bookmarkEnd w:id="43"/>
     </w:p>
     <w:p>
       <w:pPr>
         <w:pStyle w:val="references"/>
       </w:pPr>
-      <w:bookmarkStart w:id="41" w:name="_Ref225810139"/>
+      <w:bookmarkStart w:id="44" w:name="_Ref225810139"/>
       <w:r>
         <w:t>Montgomery, D.C. and Runger, G.C., 2010. </w:t>
       </w:r>
@@ -43533,13 +43783,13 @@
       <w:r>
         <w:t>. John wiley &amp; sons.</w:t>
       </w:r>
-      <w:bookmarkEnd w:id="41"/>
+      <w:bookmarkEnd w:id="44"/>
     </w:p>
     <w:p>
       <w:pPr>
         <w:pStyle w:val="references"/>
       </w:pPr>
-      <w:bookmarkStart w:id="42" w:name="_Ref225810151"/>
+      <w:bookmarkStart w:id="45" w:name="_Ref225810151"/>
       <w:r>
         <w:t>Moore, D.S., McCabe, G.P. and Craig, B.A., 2009. </w:t>
       </w:r>
@@ -43553,17 +43803,17 @@
       <w:r>
         <w:t> (Vol. 4, p. 641). New York: WH Freeman.</w:t>
       </w:r>
-      <w:bookmarkEnd w:id="42"/>
+      <w:bookmarkEnd w:id="45"/>
     </w:p>
     <w:p>
       <w:pPr>
         <w:pStyle w:val="references"/>
       </w:pPr>
-      <w:bookmarkStart w:id="43" w:name="_Ref225810175"/>
+      <w:bookmarkStart w:id="46" w:name="_Ref225810175"/>
       <w:r>
         <w:t xml:space="preserve">F. Pedregosa et al., Scikit-learn: Machine Learning in Python. [Online]. Available: </w:t>
       </w:r>
-      <w:hyperlink r:id="rId20" w:tgtFrame="_blank" w:tooltip="https://scikit-learn.org/stable/" w:history="1">
+      <w:hyperlink r:id="rId22" w:tgtFrame="_blank" w:tooltip="https://scikit-learn.org/stable/" w:history="1">
         <w:r>
           <w:rPr>
             <w:rStyle w:val="Hyperlink"/>
@@ -43580,61 +43830,31 @@
       <w:r>
         <w:t xml:space="preserve"> 2026).</w:t>
       </w:r>
-      <w:bookmarkEnd w:id="43"/>
-    </w:p>
-    <w:p>
-      <w:pPr>
-        <w:pStyle w:val="references"/>
-      </w:pPr>
-      <w:bookmarkStart w:id="44" w:name="_Ref225810192"/>
-      <w:r>
-        <w:t>Hoerl, A.E. and Kennard, R.W., 1970. Ridge regression: Biased estimation for nonorthogonal problems. Technometrics, 12(1), pp.55</w:t>
-      </w:r>
-      <w:bookmarkEnd w:id="44"/>
-      <w:r>
-        <w:t>-67</w:t>
-      </w:r>
-      <w:r>
-        <w:t>.</w:t>
-      </w:r>
-    </w:p>
-    <w:p>
-      <w:pPr>
-        <w:pStyle w:val="references"/>
-      </w:pPr>
-      <w:bookmarkStart w:id="45" w:name="_Ref225810202"/>
-      <w:r>
-        <w:t>Tibshirani, R., 1996. Regression shrinkage and selection via the lasso. Journal of the Royal Statistical Society Series B: Statistical Methodology, 58(1), pp.267-288.</w:t>
-      </w:r>
-      <w:bookmarkEnd w:id="45"/>
-    </w:p>
-    <w:p>
-      <w:pPr>
-        <w:pStyle w:val="references"/>
-      </w:pPr>
-      <w:bookmarkStart w:id="46" w:name="_Ref225810212"/>
-      <w:r>
-        <w:t>Zou, H. and Hastie, T., 2005. Regularization and variable selection via the elastic net. Journal of the Royal Statistical Society Series B: Statistical Methodology, 67(2), pp.301-320.</w:t>
-      </w:r>
       <w:bookmarkEnd w:id="46"/>
     </w:p>
     <w:p>
       <w:pPr>
         <w:pStyle w:val="references"/>
       </w:pPr>
-      <w:bookmarkStart w:id="47" w:name="_Ref225810228"/>
-      <w:r>
-        <w:t>Chen, T. and Guestrin, C., 2016, August. Xgboost: A scalable tree boosting system. In Proceedings of the 22nd acm sigkdd international conference on knowledge discovery and data mining (pp. 785-794).</w:t>
+      <w:bookmarkStart w:id="47" w:name="_Ref225810192"/>
+      <w:r>
+        <w:t>Hoerl, A.E. and Kennard, R.W., 1970. Ridge regression: Biased estimation for nonorthogonal problems. Technometrics, 12(1), pp.55</w:t>
       </w:r>
       <w:bookmarkEnd w:id="47"/>
+      <w:r>
+        <w:t>-67</w:t>
+      </w:r>
+      <w:r>
+        <w:t>.</w:t>
+      </w:r>
     </w:p>
     <w:p>
       <w:pPr>
         <w:pStyle w:val="references"/>
       </w:pPr>
-      <w:bookmarkStart w:id="48" w:name="_Ref225810238"/>
-      <w:r>
-        <w:t>Ke, G., Meng, Q., Finley, T., Wang, T., Chen, W., Ma, W., Ye, Q. and Liu, T.Y., 2017. Lightgbm: A highly efficient gradient boosting decision tree. Advances in neural information processing systems, 30.</w:t>
+      <w:bookmarkStart w:id="48" w:name="_Ref225810202"/>
+      <w:r>
+        <w:t>Tibshirani, R., 1996. Regression shrinkage and selection via the lasso. Journal of the Royal Statistical Society Series B: Statistical Methodology, 58(1), pp.267-288.</w:t>
       </w:r>
       <w:bookmarkEnd w:id="48"/>
     </w:p>
@@ -43642,47 +43862,9 @@
       <w:pPr>
         <w:pStyle w:val="references"/>
       </w:pPr>
-      <w:r>
-        <w:t>Kohavi, R., 1995, August. A study of cross-validation and bootstrap for accuracy estimation and model selection. In </w:t>
-      </w:r>
-      <w:r>
-        <w:rPr>
-          <w:i/>
-          <w:iCs/>
-        </w:rPr>
-        <w:t>Ijcai</w:t>
-      </w:r>
-      <w:r>
-        <w:t> (Vol. 14, No. 2, pp. 1137-1145).</w:t>
-      </w:r>
-    </w:p>
-    <w:p>
-      <w:pPr>
-        <w:pStyle w:val="references"/>
-      </w:pPr>
-      <w:bookmarkStart w:id="49" w:name="_Ref225810335"/>
-      <w:r>
-        <w:t>Bergstra, J. and Bengio, Y., 2012. Random search for hyper-parameter optimization. </w:t>
-      </w:r>
-      <w:r>
-        <w:rPr>
-          <w:i/>
-          <w:iCs/>
-        </w:rPr>
-        <w:t>Journal of machine learning research</w:t>
-      </w:r>
-      <w:r>
-        <w:t>, </w:t>
-      </w:r>
-      <w:r>
-        <w:rPr>
-          <w:i/>
-          <w:iCs/>
-        </w:rPr>
-        <w:t>13</w:t>
-      </w:r>
-      <w:r>
-        <w:t>(2).</w:t>
+      <w:bookmarkStart w:id="49" w:name="_Ref225810212"/>
+      <w:r>
+        <w:t>Zou, H. and Hastie, T., 2005. Regularization and variable selection via the elastic net. Journal of the Royal Statistical Society Series B: Statistical Methodology, 67(2), pp.301-320.</w:t>
       </w:r>
       <w:bookmarkEnd w:id="49"/>
     </w:p>
@@ -43690,31 +43872,99 @@
       <w:pPr>
         <w:pStyle w:val="references"/>
       </w:pPr>
-      <w:bookmarkStart w:id="50" w:name="_Ref225810347"/>
-      <w:r>
-        <w:t>Snoek, J., Larochelle, H. and Adams, R.P., 2012. Practical bayesian optimization of machine learning algorithms. </w:t>
+      <w:bookmarkStart w:id="50" w:name="_Ref225810228"/>
+      <w:r>
+        <w:t>Chen, T. and Guestrin, C., 2016, August. Xgboost: A scalable tree boosting system. In Proceedings of the 22nd acm sigkdd international conference on knowledge discovery and data mining (pp. 785-794).</w:t>
+      </w:r>
+      <w:bookmarkEnd w:id="50"/>
+    </w:p>
+    <w:p>
+      <w:pPr>
+        <w:pStyle w:val="references"/>
+      </w:pPr>
+      <w:bookmarkStart w:id="51" w:name="_Ref225810238"/>
+      <w:r>
+        <w:t>Ke, G., Meng, Q., Finley, T., Wang, T., Chen, W., Ma, W., Ye, Q. and Liu, T.Y., 2017. Lightgbm: A highly efficient gradient boosting decision tree. Advances in neural information processing systems, 30.</w:t>
+      </w:r>
+      <w:bookmarkEnd w:id="51"/>
+    </w:p>
+    <w:p>
+      <w:pPr>
+        <w:pStyle w:val="references"/>
+      </w:pPr>
+      <w:r>
+        <w:t>Kohavi, R., 1995, August. A study of cross-validation and bootstrap for accuracy estimation and model selection. In </w:t>
       </w:r>
       <w:r>
         <w:rPr>
           <w:i/>
           <w:iCs/>
         </w:rPr>
-        <w:t>Advances in neural information processing systems</w:t>
-      </w:r>
-      <w:r>
-        <w:t>, </w:t>
+        <w:t>Ijcai</w:t>
+      </w:r>
+      <w:r>
+        <w:t> (Vol. 14, No. 2, pp. 1137-1145).</w:t>
+      </w:r>
+    </w:p>
+    <w:p>
+      <w:pPr>
+        <w:pStyle w:val="references"/>
+      </w:pPr>
+      <w:bookmarkStart w:id="52" w:name="_Ref225810335"/>
+      <w:r>
+        <w:t>Bergstra, J. and Bengio, Y., 2012. Random search for hyper-parameter optimization. </w:t>
       </w:r>
       <w:r>
         <w:rPr>
           <w:i/>
           <w:iCs/>
         </w:rPr>
+        <w:t>Journal of machine learning research</w:t>
+      </w:r>
+      <w:r>
+        <w:t>, </w:t>
+      </w:r>
+      <w:r>
+        <w:rPr>
+          <w:i/>
+          <w:iCs/>
+        </w:rPr>
+        <w:t>13</w:t>
+      </w:r>
+      <w:r>
+        <w:t>(2).</w:t>
+      </w:r>
+      <w:bookmarkEnd w:id="52"/>
+    </w:p>
+    <w:p>
+      <w:pPr>
+        <w:pStyle w:val="references"/>
+      </w:pPr>
+      <w:bookmarkStart w:id="53" w:name="_Ref225810347"/>
+      <w:r>
+        <w:t>Snoek, J., Larochelle, H. and Adams, R.P., 2012. Practical bayesian optimization of machine learning algorithms. </w:t>
+      </w:r>
+      <w:r>
+        <w:rPr>
+          <w:i/>
+          <w:iCs/>
+        </w:rPr>
+        <w:t>Advances in neural information processing systems</w:t>
+      </w:r>
+      <w:r>
+        <w:t>, </w:t>
+      </w:r>
+      <w:r>
+        <w:rPr>
+          <w:i/>
+          <w:iCs/>
+        </w:rPr>
         <w:t>25</w:t>
       </w:r>
       <w:r>
         <w:t>.</w:t>
       </w:r>
-      <w:bookmarkEnd w:id="50"/>
+      <w:bookmarkEnd w:id="53"/>
     </w:p>
     <w:p>
       <w:pPr>
@@ -45709,7 +45959,6 @@
   <w:style w:type="character" w:default="1" w:styleId="DefaultParagraphFont">
     <w:name w:val="Default Paragraph Font"/>
     <w:uiPriority w:val="1"/>
-    <w:semiHidden/>
     <w:unhideWhenUsed/>
   </w:style>
   <w:style w:type="table" w:default="1" w:styleId="TableNormal">

</xml_diff>

<commit_message>
Italic reci za nove pasuse
</commit_message>
<xml_diff>
--- a/Izvestaj/Predviđanje_performansi_NFL_igrača_putem_mašinskog_učenja_Milan_Jovkić_Uroš_Petrašković.docx
+++ b/Izvestaj/Predviđanje_performansi_NFL_igrača_putem_mašinskog_učenja_Milan_Jovkić_Uroš_Petrašković.docx
@@ -2877,27 +2877,14 @@
       <w:r>
         <w:t xml:space="preserve">Tabela </w:t>
       </w:r>
-      <w:r>
-        <w:fldChar w:fldCharType="begin"/>
-      </w:r>
-      <w:r>
-        <w:instrText xml:space="preserve"> SEQ Tabela \* ARABIC </w:instrText>
-      </w:r>
-      <w:r>
-        <w:fldChar w:fldCharType="separate"/>
-      </w:r>
-      <w:r>
-        <w:rPr>
-          <w:noProof/>
-        </w:rPr>
-        <w:t>1</w:t>
-      </w:r>
-      <w:r>
-        <w:rPr>
-          <w:noProof/>
-        </w:rPr>
-        <w:fldChar w:fldCharType="end"/>
-      </w:r>
+      <w:fldSimple w:instr=" SEQ Tabela \* ARABIC ">
+        <w:r>
+          <w:rPr>
+            <w:noProof/>
+          </w:rPr>
+          <w:t>1</w:t>
+        </w:r>
+      </w:fldSimple>
       <w:bookmarkEnd w:id="1"/>
       <w:r>
         <w:t xml:space="preserve"> Obim data seta</w:t>
@@ -3014,27 +3001,14 @@
       <w:r>
         <w:t xml:space="preserve">Slika </w:t>
       </w:r>
-      <w:r>
-        <w:fldChar w:fldCharType="begin"/>
-      </w:r>
-      <w:r>
-        <w:instrText xml:space="preserve"> SEQ Slika \* ARABIC </w:instrText>
-      </w:r>
-      <w:r>
-        <w:fldChar w:fldCharType="separate"/>
-      </w:r>
-      <w:r>
-        <w:rPr>
-          <w:noProof/>
-        </w:rPr>
-        <w:t>1</w:t>
-      </w:r>
-      <w:r>
-        <w:rPr>
-          <w:noProof/>
-        </w:rPr>
-        <w:fldChar w:fldCharType="end"/>
-      </w:r>
+      <w:fldSimple w:instr=" SEQ Slika \* ARABIC ">
+        <w:r>
+          <w:rPr>
+            <w:noProof/>
+          </w:rPr>
+          <w:t>1</w:t>
+        </w:r>
+      </w:fldSimple>
       <w:bookmarkEnd w:id="2"/>
       <w:r>
         <w:rPr>
@@ -3264,27 +3238,14 @@
       <w:r>
         <w:t xml:space="preserve">Slika </w:t>
       </w:r>
-      <w:r>
-        <w:fldChar w:fldCharType="begin"/>
-      </w:r>
-      <w:r>
-        <w:instrText xml:space="preserve"> SEQ Slika \* ARABIC </w:instrText>
-      </w:r>
-      <w:r>
-        <w:fldChar w:fldCharType="separate"/>
-      </w:r>
-      <w:r>
-        <w:rPr>
-          <w:noProof/>
-        </w:rPr>
-        <w:t>2</w:t>
-      </w:r>
-      <w:r>
-        <w:rPr>
-          <w:noProof/>
-        </w:rPr>
-        <w:fldChar w:fldCharType="end"/>
-      </w:r>
+      <w:fldSimple w:instr=" SEQ Slika \* ARABIC ">
+        <w:r>
+          <w:rPr>
+            <w:noProof/>
+          </w:rPr>
+          <w:t>2</w:t>
+        </w:r>
+      </w:fldSimple>
       <w:bookmarkEnd w:id="3"/>
       <w:r>
         <w:t xml:space="preserve"> </w:t>
@@ -3466,27 +3427,14 @@
       <w:r>
         <w:t xml:space="preserve">Slika </w:t>
       </w:r>
-      <w:r>
-        <w:fldChar w:fldCharType="begin"/>
-      </w:r>
-      <w:r>
-        <w:instrText xml:space="preserve"> SEQ Slika \* ARABIC </w:instrText>
-      </w:r>
-      <w:r>
-        <w:fldChar w:fldCharType="separate"/>
-      </w:r>
-      <w:r>
-        <w:rPr>
-          <w:noProof/>
-        </w:rPr>
-        <w:t>3</w:t>
-      </w:r>
-      <w:r>
-        <w:rPr>
-          <w:noProof/>
-        </w:rPr>
-        <w:fldChar w:fldCharType="end"/>
-      </w:r>
+      <w:fldSimple w:instr=" SEQ Slika \* ARABIC ">
+        <w:r>
+          <w:rPr>
+            <w:noProof/>
+          </w:rPr>
+          <w:t>3</w:t>
+        </w:r>
+      </w:fldSimple>
       <w:bookmarkEnd w:id="4"/>
       <w:r>
         <w:t xml:space="preserve"> </w:t>
@@ -3666,27 +3614,14 @@
       <w:r>
         <w:t xml:space="preserve">Slika </w:t>
       </w:r>
-      <w:r>
-        <w:fldChar w:fldCharType="begin"/>
-      </w:r>
-      <w:r>
-        <w:instrText xml:space="preserve"> SEQ Slika \* ARABIC </w:instrText>
-      </w:r>
-      <w:r>
-        <w:fldChar w:fldCharType="separate"/>
-      </w:r>
-      <w:r>
-        <w:rPr>
-          <w:noProof/>
-        </w:rPr>
-        <w:t>4</w:t>
-      </w:r>
-      <w:r>
-        <w:rPr>
-          <w:noProof/>
-        </w:rPr>
-        <w:fldChar w:fldCharType="end"/>
-      </w:r>
+      <w:fldSimple w:instr=" SEQ Slika \* ARABIC ">
+        <w:r>
+          <w:rPr>
+            <w:noProof/>
+          </w:rPr>
+          <w:t>4</w:t>
+        </w:r>
+      </w:fldSimple>
       <w:bookmarkEnd w:id="5"/>
       <w:r>
         <w:t xml:space="preserve"> </w:t>
@@ -3946,27 +3881,14 @@
       <w:r>
         <w:t xml:space="preserve">Slika </w:t>
       </w:r>
-      <w:r>
-        <w:fldChar w:fldCharType="begin"/>
-      </w:r>
-      <w:r>
-        <w:instrText xml:space="preserve"> SEQ Slika \* ARABIC </w:instrText>
-      </w:r>
-      <w:r>
-        <w:fldChar w:fldCharType="separate"/>
-      </w:r>
-      <w:r>
-        <w:rPr>
-          <w:noProof/>
-        </w:rPr>
-        <w:t>5</w:t>
-      </w:r>
-      <w:r>
-        <w:rPr>
-          <w:noProof/>
-        </w:rPr>
-        <w:fldChar w:fldCharType="end"/>
-      </w:r>
+      <w:fldSimple w:instr=" SEQ Slika \* ARABIC ">
+        <w:r>
+          <w:rPr>
+            <w:noProof/>
+          </w:rPr>
+          <w:t>5</w:t>
+        </w:r>
+      </w:fldSimple>
       <w:bookmarkEnd w:id="6"/>
       <w:r>
         <w:t xml:space="preserve"> </w:t>
@@ -4352,27 +4274,14 @@
       <w:r>
         <w:t xml:space="preserve">Slika </w:t>
       </w:r>
-      <w:r>
-        <w:fldChar w:fldCharType="begin"/>
-      </w:r>
-      <w:r>
-        <w:instrText xml:space="preserve"> SEQ Slika \* ARABIC </w:instrText>
-      </w:r>
-      <w:r>
-        <w:fldChar w:fldCharType="separate"/>
-      </w:r>
-      <w:r>
-        <w:rPr>
-          <w:noProof/>
-        </w:rPr>
-        <w:t>6</w:t>
-      </w:r>
-      <w:r>
-        <w:rPr>
-          <w:noProof/>
-        </w:rPr>
-        <w:fldChar w:fldCharType="end"/>
-      </w:r>
+      <w:fldSimple w:instr=" SEQ Slika \* ARABIC ">
+        <w:r>
+          <w:rPr>
+            <w:noProof/>
+          </w:rPr>
+          <w:t>6</w:t>
+        </w:r>
+      </w:fldSimple>
       <w:bookmarkEnd w:id="7"/>
       <w:r>
         <w:t xml:space="preserve"> </w:t>
@@ -4773,27 +4682,14 @@
       <w:r>
         <w:t xml:space="preserve">Slika </w:t>
       </w:r>
-      <w:r>
-        <w:fldChar w:fldCharType="begin"/>
-      </w:r>
-      <w:r>
-        <w:instrText xml:space="preserve"> SEQ Slika \* ARABIC </w:instrText>
-      </w:r>
-      <w:r>
-        <w:fldChar w:fldCharType="separate"/>
-      </w:r>
-      <w:r>
-        <w:rPr>
-          <w:noProof/>
-        </w:rPr>
-        <w:t>7</w:t>
-      </w:r>
-      <w:r>
-        <w:rPr>
-          <w:noProof/>
-        </w:rPr>
-        <w:fldChar w:fldCharType="end"/>
-      </w:r>
+      <w:fldSimple w:instr=" SEQ Slika \* ARABIC ">
+        <w:r>
+          <w:rPr>
+            <w:noProof/>
+          </w:rPr>
+          <w:t>7</w:t>
+        </w:r>
+      </w:fldSimple>
       <w:bookmarkEnd w:id="8"/>
       <w:r>
         <w:t xml:space="preserve"> </w:t>
@@ -4861,27 +4757,14 @@
       <w:r>
         <w:t xml:space="preserve">Slika </w:t>
       </w:r>
-      <w:r>
-        <w:fldChar w:fldCharType="begin"/>
-      </w:r>
-      <w:r>
-        <w:instrText xml:space="preserve"> SEQ Slika \* ARABIC </w:instrText>
-      </w:r>
-      <w:r>
-        <w:fldChar w:fldCharType="separate"/>
-      </w:r>
-      <w:r>
-        <w:rPr>
-          <w:noProof/>
-        </w:rPr>
-        <w:t>8</w:t>
-      </w:r>
-      <w:r>
-        <w:rPr>
-          <w:noProof/>
-        </w:rPr>
-        <w:fldChar w:fldCharType="end"/>
-      </w:r>
+      <w:fldSimple w:instr=" SEQ Slika \* ARABIC ">
+        <w:r>
+          <w:rPr>
+            <w:noProof/>
+          </w:rPr>
+          <w:t>8</w:t>
+        </w:r>
+      </w:fldSimple>
       <w:bookmarkEnd w:id="9"/>
       <w:r>
         <w:t xml:space="preserve"> </w:t>
@@ -6346,27 +6229,14 @@
       <w:r>
         <w:t xml:space="preserve">Tabela </w:t>
       </w:r>
-      <w:r>
-        <w:fldChar w:fldCharType="begin"/>
-      </w:r>
-      <w:r>
-        <w:instrText xml:space="preserve"> SEQ Tabela \* ARABIC </w:instrText>
-      </w:r>
-      <w:r>
-        <w:fldChar w:fldCharType="separate"/>
-      </w:r>
-      <w:r>
-        <w:rPr>
-          <w:noProof/>
-        </w:rPr>
-        <w:t>2</w:t>
-      </w:r>
-      <w:r>
-        <w:rPr>
-          <w:noProof/>
-        </w:rPr>
-        <w:fldChar w:fldCharType="end"/>
-      </w:r>
+      <w:fldSimple w:instr=" SEQ Tabela \* ARABIC ">
+        <w:r>
+          <w:rPr>
+            <w:noProof/>
+          </w:rPr>
+          <w:t>2</w:t>
+        </w:r>
+      </w:fldSimple>
       <w:bookmarkEnd w:id="10"/>
       <w:r>
         <w:t xml:space="preserve"> GirdSearch QB</w:t>
@@ -7043,27 +6913,14 @@
       <w:r>
         <w:t xml:space="preserve">Tabela </w:t>
       </w:r>
-      <w:r>
-        <w:fldChar w:fldCharType="begin"/>
-      </w:r>
-      <w:r>
-        <w:instrText xml:space="preserve"> SEQ Tabela \* ARABIC </w:instrText>
-      </w:r>
-      <w:r>
-        <w:fldChar w:fldCharType="separate"/>
-      </w:r>
-      <w:r>
-        <w:rPr>
-          <w:noProof/>
-        </w:rPr>
-        <w:t>3</w:t>
-      </w:r>
-      <w:r>
-        <w:rPr>
-          <w:noProof/>
-        </w:rPr>
-        <w:fldChar w:fldCharType="end"/>
-      </w:r>
+      <w:fldSimple w:instr=" SEQ Tabela \* ARABIC ">
+        <w:r>
+          <w:rPr>
+            <w:noProof/>
+          </w:rPr>
+          <w:t>3</w:t>
+        </w:r>
+      </w:fldSimple>
       <w:bookmarkEnd w:id="11"/>
       <w:r>
         <w:t xml:space="preserve"> </w:t>
@@ -7742,27 +7599,14 @@
       <w:r>
         <w:t xml:space="preserve">Tabela </w:t>
       </w:r>
-      <w:r>
-        <w:fldChar w:fldCharType="begin"/>
-      </w:r>
-      <w:r>
-        <w:instrText xml:space="preserve"> SEQ Tabela \* ARABIC </w:instrText>
-      </w:r>
-      <w:r>
-        <w:fldChar w:fldCharType="separate"/>
-      </w:r>
-      <w:r>
-        <w:rPr>
-          <w:noProof/>
-        </w:rPr>
-        <w:t>4</w:t>
-      </w:r>
-      <w:r>
-        <w:rPr>
-          <w:noProof/>
-        </w:rPr>
-        <w:fldChar w:fldCharType="end"/>
-      </w:r>
+      <w:fldSimple w:instr=" SEQ Tabela \* ARABIC ">
+        <w:r>
+          <w:rPr>
+            <w:noProof/>
+          </w:rPr>
+          <w:t>4</w:t>
+        </w:r>
+      </w:fldSimple>
       <w:bookmarkEnd w:id="12"/>
       <w:r>
         <w:t xml:space="preserve"> </w:t>
@@ -8441,27 +8285,14 @@
       <w:r>
         <w:t xml:space="preserve">Tabela </w:t>
       </w:r>
-      <w:r>
-        <w:fldChar w:fldCharType="begin"/>
-      </w:r>
-      <w:r>
-        <w:instrText xml:space="preserve"> SEQ Tabela \* ARABIC </w:instrText>
-      </w:r>
-      <w:r>
-        <w:fldChar w:fldCharType="separate"/>
-      </w:r>
-      <w:r>
-        <w:rPr>
-          <w:noProof/>
-        </w:rPr>
-        <w:t>5</w:t>
-      </w:r>
-      <w:r>
-        <w:rPr>
-          <w:noProof/>
-        </w:rPr>
-        <w:fldChar w:fldCharType="end"/>
-      </w:r>
+      <w:fldSimple w:instr=" SEQ Tabela \* ARABIC ">
+        <w:r>
+          <w:rPr>
+            <w:noProof/>
+          </w:rPr>
+          <w:t>5</w:t>
+        </w:r>
+      </w:fldSimple>
       <w:bookmarkEnd w:id="13"/>
       <w:r>
         <w:t xml:space="preserve"> </w:t>
@@ -9290,27 +9121,14 @@
       <w:r>
         <w:t xml:space="preserve">Tabela </w:t>
       </w:r>
-      <w:r>
-        <w:fldChar w:fldCharType="begin"/>
-      </w:r>
-      <w:r>
-        <w:instrText xml:space="preserve"> SEQ Tabela \* ARABIC </w:instrText>
-      </w:r>
-      <w:r>
-        <w:fldChar w:fldCharType="separate"/>
-      </w:r>
-      <w:r>
-        <w:rPr>
-          <w:noProof/>
-        </w:rPr>
-        <w:t>6</w:t>
-      </w:r>
-      <w:r>
-        <w:rPr>
-          <w:noProof/>
-        </w:rPr>
-        <w:fldChar w:fldCharType="end"/>
-      </w:r>
+      <w:fldSimple w:instr=" SEQ Tabela \* ARABIC ">
+        <w:r>
+          <w:rPr>
+            <w:noProof/>
+          </w:rPr>
+          <w:t>6</w:t>
+        </w:r>
+      </w:fldSimple>
       <w:bookmarkEnd w:id="14"/>
       <w:r>
         <w:t xml:space="preserve"> </w:t>
@@ -9919,27 +9737,14 @@
       <w:r>
         <w:t xml:space="preserve">Tabela </w:t>
       </w:r>
-      <w:r>
-        <w:fldChar w:fldCharType="begin"/>
-      </w:r>
-      <w:r>
-        <w:instrText xml:space="preserve"> SEQ Tabela \* ARABIC </w:instrText>
-      </w:r>
-      <w:r>
-        <w:fldChar w:fldCharType="separate"/>
-      </w:r>
-      <w:r>
-        <w:rPr>
-          <w:noProof/>
-        </w:rPr>
-        <w:t>7</w:t>
-      </w:r>
-      <w:r>
-        <w:rPr>
-          <w:noProof/>
-        </w:rPr>
-        <w:fldChar w:fldCharType="end"/>
-      </w:r>
+      <w:fldSimple w:instr=" SEQ Tabela \* ARABIC ">
+        <w:r>
+          <w:rPr>
+            <w:noProof/>
+          </w:rPr>
+          <w:t>7</w:t>
+        </w:r>
+      </w:fldSimple>
       <w:bookmarkEnd w:id="15"/>
       <w:r>
         <w:t xml:space="preserve"> </w:t>
@@ -10548,27 +10353,14 @@
       <w:r>
         <w:t xml:space="preserve">Tabela </w:t>
       </w:r>
-      <w:r>
-        <w:fldChar w:fldCharType="begin"/>
-      </w:r>
-      <w:r>
-        <w:instrText xml:space="preserve"> SEQ Tabela \* ARABIC </w:instrText>
-      </w:r>
-      <w:r>
-        <w:fldChar w:fldCharType="separate"/>
-      </w:r>
-      <w:r>
-        <w:rPr>
-          <w:noProof/>
-        </w:rPr>
-        <w:t>8</w:t>
-      </w:r>
-      <w:r>
-        <w:rPr>
-          <w:noProof/>
-        </w:rPr>
-        <w:fldChar w:fldCharType="end"/>
-      </w:r>
+      <w:fldSimple w:instr=" SEQ Tabela \* ARABIC ">
+        <w:r>
+          <w:rPr>
+            <w:noProof/>
+          </w:rPr>
+          <w:t>8</w:t>
+        </w:r>
+      </w:fldSimple>
       <w:bookmarkEnd w:id="16"/>
       <w:r>
         <w:t xml:space="preserve"> </w:t>
@@ -11177,27 +10969,14 @@
       <w:r>
         <w:t xml:space="preserve">Tabela </w:t>
       </w:r>
-      <w:r>
-        <w:fldChar w:fldCharType="begin"/>
-      </w:r>
-      <w:r>
-        <w:instrText xml:space="preserve"> SEQ Tabela \* ARABIC </w:instrText>
-      </w:r>
-      <w:r>
-        <w:fldChar w:fldCharType="separate"/>
-      </w:r>
-      <w:r>
-        <w:rPr>
-          <w:noProof/>
-        </w:rPr>
-        <w:t>9</w:t>
-      </w:r>
-      <w:r>
-        <w:rPr>
-          <w:noProof/>
-        </w:rPr>
-        <w:fldChar w:fldCharType="end"/>
-      </w:r>
+      <w:fldSimple w:instr=" SEQ Tabela \* ARABIC ">
+        <w:r>
+          <w:rPr>
+            <w:noProof/>
+          </w:rPr>
+          <w:t>9</w:t>
+        </w:r>
+      </w:fldSimple>
       <w:bookmarkEnd w:id="17"/>
       <w:r>
         <w:t xml:space="preserve"> </w:t>
@@ -14410,27 +14189,14 @@
       <w:r>
         <w:t xml:space="preserve">Tabela </w:t>
       </w:r>
-      <w:r>
-        <w:fldChar w:fldCharType="begin"/>
-      </w:r>
-      <w:r>
-        <w:instrText xml:space="preserve"> SEQ Tabela \* ARABIC </w:instrText>
-      </w:r>
-      <w:r>
-        <w:fldChar w:fldCharType="separate"/>
-      </w:r>
-      <w:r>
-        <w:rPr>
-          <w:noProof/>
-        </w:rPr>
-        <w:t>10</w:t>
-      </w:r>
-      <w:r>
-        <w:rPr>
-          <w:noProof/>
-        </w:rPr>
-        <w:fldChar w:fldCharType="end"/>
-      </w:r>
+      <w:fldSimple w:instr=" SEQ Tabela \* ARABIC ">
+        <w:r>
+          <w:rPr>
+            <w:noProof/>
+          </w:rPr>
+          <w:t>10</w:t>
+        </w:r>
+      </w:fldSimple>
       <w:bookmarkEnd w:id="18"/>
       <w:r>
         <w:t xml:space="preserve"> QB rezultati modela za različite optimizacione strategije</w:t>
@@ -17437,27 +17203,14 @@
       <w:r>
         <w:t xml:space="preserve">Tabela </w:t>
       </w:r>
-      <w:r>
-        <w:fldChar w:fldCharType="begin"/>
-      </w:r>
-      <w:r>
-        <w:instrText xml:space="preserve"> SEQ Tabela \* ARABIC </w:instrText>
-      </w:r>
-      <w:r>
-        <w:fldChar w:fldCharType="separate"/>
-      </w:r>
-      <w:r>
-        <w:rPr>
-          <w:noProof/>
-        </w:rPr>
-        <w:t>11</w:t>
-      </w:r>
-      <w:r>
-        <w:rPr>
-          <w:noProof/>
-        </w:rPr>
-        <w:fldChar w:fldCharType="end"/>
-      </w:r>
+      <w:fldSimple w:instr=" SEQ Tabela \* ARABIC ">
+        <w:r>
+          <w:rPr>
+            <w:noProof/>
+          </w:rPr>
+          <w:t>11</w:t>
+        </w:r>
+      </w:fldSimple>
       <w:bookmarkEnd w:id="19"/>
       <w:r>
         <w:t xml:space="preserve"> RB </w:t>
@@ -20546,27 +20299,14 @@
       <w:r>
         <w:t xml:space="preserve">Tabela </w:t>
       </w:r>
-      <w:r>
-        <w:fldChar w:fldCharType="begin"/>
-      </w:r>
-      <w:r>
-        <w:instrText xml:space="preserve"> SEQ Tabela \* ARABIC </w:instrText>
-      </w:r>
-      <w:r>
-        <w:fldChar w:fldCharType="separate"/>
-      </w:r>
-      <w:r>
-        <w:rPr>
-          <w:noProof/>
-        </w:rPr>
-        <w:t>12</w:t>
-      </w:r>
-      <w:r>
-        <w:rPr>
-          <w:noProof/>
-        </w:rPr>
-        <w:fldChar w:fldCharType="end"/>
-      </w:r>
+      <w:fldSimple w:instr=" SEQ Tabela \* ARABIC ">
+        <w:r>
+          <w:rPr>
+            <w:noProof/>
+          </w:rPr>
+          <w:t>12</w:t>
+        </w:r>
+      </w:fldSimple>
       <w:bookmarkEnd w:id="20"/>
       <w:r>
         <w:t xml:space="preserve"> TE </w:t>
@@ -23575,27 +23315,14 @@
       <w:r>
         <w:t xml:space="preserve">Tabela </w:t>
       </w:r>
-      <w:r>
-        <w:fldChar w:fldCharType="begin"/>
-      </w:r>
-      <w:r>
-        <w:instrText xml:space="preserve"> SEQ Tabela \* ARABIC </w:instrText>
-      </w:r>
-      <w:r>
-        <w:fldChar w:fldCharType="separate"/>
-      </w:r>
-      <w:r>
-        <w:rPr>
-          <w:noProof/>
-        </w:rPr>
-        <w:t>13</w:t>
-      </w:r>
-      <w:r>
-        <w:rPr>
-          <w:noProof/>
-        </w:rPr>
-        <w:fldChar w:fldCharType="end"/>
-      </w:r>
+      <w:fldSimple w:instr=" SEQ Tabela \* ARABIC ">
+        <w:r>
+          <w:rPr>
+            <w:noProof/>
+          </w:rPr>
+          <w:t>13</w:t>
+        </w:r>
+      </w:fldSimple>
       <w:bookmarkEnd w:id="21"/>
       <w:r>
         <w:t xml:space="preserve"> WR </w:t>
@@ -25663,27 +25390,14 @@
       <w:r>
         <w:t xml:space="preserve">Tabela </w:t>
       </w:r>
-      <w:r>
-        <w:fldChar w:fldCharType="begin"/>
-      </w:r>
-      <w:r>
-        <w:instrText xml:space="preserve"> SEQ Tabela \* ARABIC </w:instrText>
-      </w:r>
-      <w:r>
-        <w:fldChar w:fldCharType="separate"/>
-      </w:r>
-      <w:r>
-        <w:rPr>
-          <w:noProof/>
-        </w:rPr>
-        <w:t>14</w:t>
-      </w:r>
-      <w:r>
-        <w:rPr>
-          <w:noProof/>
-        </w:rPr>
-        <w:fldChar w:fldCharType="end"/>
-      </w:r>
+      <w:fldSimple w:instr=" SEQ Tabela \* ARABIC ">
+        <w:r>
+          <w:rPr>
+            <w:noProof/>
+          </w:rPr>
+          <w:t>14</w:t>
+        </w:r>
+      </w:fldSimple>
       <w:bookmarkEnd w:id="23"/>
       <w:r>
         <w:t xml:space="preserve"> QB RMSE rezultati za walk forward validaciju</w:t>
@@ -27327,27 +27041,14 @@
       <w:r>
         <w:t xml:space="preserve">Tabela </w:t>
       </w:r>
-      <w:r>
-        <w:fldChar w:fldCharType="begin"/>
-      </w:r>
-      <w:r>
-        <w:instrText xml:space="preserve"> SEQ Tabela \* ARABIC </w:instrText>
-      </w:r>
-      <w:r>
-        <w:fldChar w:fldCharType="separate"/>
-      </w:r>
-      <w:r>
-        <w:rPr>
-          <w:noProof/>
-        </w:rPr>
-        <w:t>15</w:t>
-      </w:r>
-      <w:r>
-        <w:rPr>
-          <w:noProof/>
-        </w:rPr>
-        <w:fldChar w:fldCharType="end"/>
-      </w:r>
+      <w:fldSimple w:instr=" SEQ Tabela \* ARABIC ">
+        <w:r>
+          <w:rPr>
+            <w:noProof/>
+          </w:rPr>
+          <w:t>15</w:t>
+        </w:r>
+      </w:fldSimple>
       <w:bookmarkEnd w:id="24"/>
       <w:r>
         <w:t xml:space="preserve"> </w:t>
@@ -29266,27 +28967,14 @@
       <w:r>
         <w:t xml:space="preserve">Tabela </w:t>
       </w:r>
-      <w:r>
-        <w:fldChar w:fldCharType="begin"/>
-      </w:r>
-      <w:r>
-        <w:instrText xml:space="preserve"> SEQ Tabela \* ARABIC </w:instrText>
-      </w:r>
-      <w:r>
-        <w:fldChar w:fldCharType="separate"/>
-      </w:r>
-      <w:r>
-        <w:rPr>
-          <w:noProof/>
-        </w:rPr>
-        <w:t>16</w:t>
-      </w:r>
-      <w:r>
-        <w:rPr>
-          <w:noProof/>
-        </w:rPr>
-        <w:fldChar w:fldCharType="end"/>
-      </w:r>
+      <w:fldSimple w:instr=" SEQ Tabela \* ARABIC ">
+        <w:r>
+          <w:rPr>
+            <w:noProof/>
+          </w:rPr>
+          <w:t>16</w:t>
+        </w:r>
+      </w:fldSimple>
       <w:bookmarkEnd w:id="25"/>
       <w:r>
         <w:t xml:space="preserve"> RB</w:t>
@@ -30933,27 +30621,14 @@
       <w:r>
         <w:t xml:space="preserve">Tabela </w:t>
       </w:r>
-      <w:r>
-        <w:fldChar w:fldCharType="begin"/>
-      </w:r>
-      <w:r>
-        <w:instrText xml:space="preserve"> SEQ Tabela \* ARABIC </w:instrText>
-      </w:r>
-      <w:r>
-        <w:fldChar w:fldCharType="separate"/>
-      </w:r>
-      <w:r>
-        <w:rPr>
-          <w:noProof/>
-        </w:rPr>
-        <w:t>17</w:t>
-      </w:r>
-      <w:r>
-        <w:rPr>
-          <w:noProof/>
-        </w:rPr>
-        <w:fldChar w:fldCharType="end"/>
-      </w:r>
+      <w:fldSimple w:instr=" SEQ Tabela \* ARABIC ">
+        <w:r>
+          <w:rPr>
+            <w:noProof/>
+          </w:rPr>
+          <w:t>17</w:t>
+        </w:r>
+      </w:fldSimple>
       <w:bookmarkEnd w:id="26"/>
       <w:r>
         <w:t xml:space="preserve"> RB </w:t>
@@ -32867,27 +32542,14 @@
       <w:r>
         <w:t xml:space="preserve">Tabela </w:t>
       </w:r>
-      <w:r>
-        <w:fldChar w:fldCharType="begin"/>
-      </w:r>
-      <w:r>
-        <w:instrText xml:space="preserve"> SEQ Tabela \* ARABIC </w:instrText>
-      </w:r>
-      <w:r>
-        <w:fldChar w:fldCharType="separate"/>
-      </w:r>
-      <w:r>
-        <w:rPr>
-          <w:noProof/>
-        </w:rPr>
-        <w:t>18</w:t>
-      </w:r>
-      <w:r>
-        <w:rPr>
-          <w:noProof/>
-        </w:rPr>
-        <w:fldChar w:fldCharType="end"/>
-      </w:r>
+      <w:fldSimple w:instr=" SEQ Tabela \* ARABIC ">
+        <w:r>
+          <w:rPr>
+            <w:noProof/>
+          </w:rPr>
+          <w:t>18</w:t>
+        </w:r>
+      </w:fldSimple>
       <w:bookmarkEnd w:id="27"/>
       <w:r>
         <w:t xml:space="preserve"> TE </w:t>
@@ -34534,27 +34196,14 @@
       <w:r>
         <w:t xml:space="preserve">Tabela </w:t>
       </w:r>
-      <w:r>
-        <w:fldChar w:fldCharType="begin"/>
-      </w:r>
-      <w:r>
-        <w:instrText xml:space="preserve"> SEQ Tabela \* ARABIC </w:instrText>
-      </w:r>
-      <w:r>
-        <w:fldChar w:fldCharType="separate"/>
-      </w:r>
-      <w:r>
-        <w:rPr>
-          <w:noProof/>
-        </w:rPr>
-        <w:t>19</w:t>
-      </w:r>
-      <w:r>
-        <w:rPr>
-          <w:noProof/>
-        </w:rPr>
-        <w:fldChar w:fldCharType="end"/>
-      </w:r>
+      <w:fldSimple w:instr=" SEQ Tabela \* ARABIC ">
+        <w:r>
+          <w:rPr>
+            <w:noProof/>
+          </w:rPr>
+          <w:t>19</w:t>
+        </w:r>
+      </w:fldSimple>
       <w:bookmarkEnd w:id="28"/>
       <w:r>
         <w:t xml:space="preserve"> TE </w:t>
@@ -36446,27 +36095,14 @@
       <w:r>
         <w:t xml:space="preserve">Tabela </w:t>
       </w:r>
-      <w:r>
-        <w:fldChar w:fldCharType="begin"/>
-      </w:r>
-      <w:r>
-        <w:instrText xml:space="preserve"> SEQ Tabela \* ARABIC </w:instrText>
-      </w:r>
-      <w:r>
-        <w:fldChar w:fldCharType="separate"/>
-      </w:r>
-      <w:r>
-        <w:rPr>
-          <w:noProof/>
-        </w:rPr>
-        <w:t>20</w:t>
-      </w:r>
-      <w:r>
-        <w:rPr>
-          <w:noProof/>
-        </w:rPr>
-        <w:fldChar w:fldCharType="end"/>
-      </w:r>
+      <w:fldSimple w:instr=" SEQ Tabela \* ARABIC ">
+        <w:r>
+          <w:rPr>
+            <w:noProof/>
+          </w:rPr>
+          <w:t>20</w:t>
+        </w:r>
+      </w:fldSimple>
       <w:bookmarkEnd w:id="29"/>
       <w:r>
         <w:t xml:space="preserve"> WR </w:t>
@@ -38113,27 +37749,14 @@
       <w:r>
         <w:t xml:space="preserve">Tabela </w:t>
       </w:r>
-      <w:r>
-        <w:fldChar w:fldCharType="begin"/>
-      </w:r>
-      <w:r>
-        <w:instrText xml:space="preserve"> SEQ Tabela \* ARABIC </w:instrText>
-      </w:r>
-      <w:r>
-        <w:fldChar w:fldCharType="separate"/>
-      </w:r>
-      <w:r>
-        <w:rPr>
-          <w:noProof/>
-        </w:rPr>
-        <w:t>21</w:t>
-      </w:r>
-      <w:r>
-        <w:rPr>
-          <w:noProof/>
-        </w:rPr>
-        <w:fldChar w:fldCharType="end"/>
-      </w:r>
+      <w:fldSimple w:instr=" SEQ Tabela \* ARABIC ">
+        <w:r>
+          <w:rPr>
+            <w:noProof/>
+          </w:rPr>
+          <w:t>21</w:t>
+        </w:r>
+      </w:fldSimple>
       <w:bookmarkEnd w:id="30"/>
       <w:r>
         <w:t xml:space="preserve"> WR </w:t>
@@ -38191,7 +37814,119 @@
         <w:rPr>
           <w:lang w:val="en-US"/>
         </w:rPr>
-        <w:t xml:space="preserve">Kretanje loss funkcije kroz etape praćeno je isključivo za XGBoost i LightGBM modele. Razlog tome leži u prirodi ovih algoritama, radi se o sekvencijalnim boosting metodama koje u svakoj etapi dodaju novo stablo i minimizuju grešku na preostalim rezidualima, što omogućava praćenje train i test RMSE kroz iteracije. Ostali primenjeni modeli ne poseduju ovu osobinu: linearni modeli (Ridge, Lasso, ElasticNet) imaju zatvoreno analitičko rešenje bez iterativnog treninga, Random Forest gradi stabla nezavisno paralelno (bagging) bez sekvencijalnog učenja, dok kNN uopšte nema fazu treninga u klasičnom smislu. </w:t>
+        <w:t xml:space="preserve">Kretanje </w:t>
+      </w:r>
+      <w:r>
+        <w:rPr>
+          <w:i/>
+          <w:iCs/>
+          <w:lang w:val="en-US"/>
+        </w:rPr>
+        <w:t>loss</w:t>
+      </w:r>
+      <w:r>
+        <w:rPr>
+          <w:lang w:val="en-US"/>
+        </w:rPr>
+        <w:t xml:space="preserve"> funkcije kroz etape praćeno je isključivo za </w:t>
+      </w:r>
+      <w:r>
+        <w:rPr>
+          <w:i/>
+          <w:iCs/>
+          <w:lang w:val="en-US"/>
+        </w:rPr>
+        <w:t>XGBoost</w:t>
+      </w:r>
+      <w:r>
+        <w:rPr>
+          <w:lang w:val="en-US"/>
+        </w:rPr>
+        <w:t xml:space="preserve"> i </w:t>
+      </w:r>
+      <w:r>
+        <w:rPr>
+          <w:i/>
+          <w:iCs/>
+          <w:lang w:val="en-US"/>
+        </w:rPr>
+        <w:t>LightGBM</w:t>
+      </w:r>
+      <w:r>
+        <w:rPr>
+          <w:lang w:val="en-US"/>
+        </w:rPr>
+        <w:t xml:space="preserve"> modele. Razlog tome leži u prirodi ovih algoritama, radi se o sekvencijalnim boosting metodama koje u svakoj etapi dodaju novo stablo i minimizuju grešku na preostalim rezidualima, što omogućava praćenje train i test </w:t>
+      </w:r>
+      <w:r>
+        <w:rPr>
+          <w:i/>
+          <w:iCs/>
+          <w:lang w:val="en-US"/>
+        </w:rPr>
+        <w:t>RMSE</w:t>
+      </w:r>
+      <w:r>
+        <w:rPr>
+          <w:lang w:val="en-US"/>
+        </w:rPr>
+        <w:t xml:space="preserve"> kroz iteracije. Ostali primenjeni modeli ne poseduju ovu osobinu: linearni modeli (</w:t>
+      </w:r>
+      <w:r>
+        <w:rPr>
+          <w:i/>
+          <w:iCs/>
+          <w:lang w:val="en-US"/>
+        </w:rPr>
+        <w:t>Ridge, Lasso, ElasticNet</w:t>
+      </w:r>
+      <w:r>
+        <w:rPr>
+          <w:lang w:val="en-US"/>
+        </w:rPr>
+        <w:t xml:space="preserve">) imaju zatvoreno analitičko rešenje bez iterativnog treninga, </w:t>
+      </w:r>
+      <w:r>
+        <w:rPr>
+          <w:i/>
+          <w:iCs/>
+          <w:lang w:val="en-US"/>
+        </w:rPr>
+        <w:t>Random Forest</w:t>
+      </w:r>
+      <w:r>
+        <w:rPr>
+          <w:lang w:val="en-US"/>
+        </w:rPr>
+        <w:t xml:space="preserve"> gradi stabla nezavisno paralelno (</w:t>
+      </w:r>
+      <w:r>
+        <w:rPr>
+          <w:i/>
+          <w:iCs/>
+          <w:lang w:val="en-US"/>
+        </w:rPr>
+        <w:t>bagging</w:t>
+      </w:r>
+      <w:r>
+        <w:rPr>
+          <w:lang w:val="en-US"/>
+        </w:rPr>
+        <w:t xml:space="preserve">) bez sekvencijalnog učenja, dok </w:t>
+      </w:r>
+      <w:r>
+        <w:rPr>
+          <w:i/>
+          <w:iCs/>
+          <w:lang w:val="en-US"/>
+        </w:rPr>
+        <w:t>kNN</w:t>
+      </w:r>
+      <w:r>
+        <w:rPr>
+          <w:lang w:val="en-US"/>
+        </w:rPr>
+        <w:t xml:space="preserve"> uopšte nema fazu treninga u klasičnom smislu. </w:t>
       </w:r>
     </w:p>
     <w:p>
@@ -38261,7 +37996,63 @@
         <w:rPr>
           <w:lang w:val="en-US"/>
         </w:rPr>
-        <w:t xml:space="preserve"> tok loss funkcije za XGBoost i LightGBM na WR poziciji. Može se uočiti blagi underfitting, train i test krive su bliske jedna drugoj i obe nastavljaju da opadaju do kraja posmatranog broja etapa, bez jasnog minimuma test greške, što ukazuje da modeli nisu dostigli svoj optimalni kapacitet. </w:t>
+        <w:t xml:space="preserve"> tok </w:t>
+      </w:r>
+      <w:r>
+        <w:rPr>
+          <w:i/>
+          <w:iCs/>
+          <w:lang w:val="en-US"/>
+        </w:rPr>
+        <w:t>loss</w:t>
+      </w:r>
+      <w:r>
+        <w:rPr>
+          <w:lang w:val="en-US"/>
+        </w:rPr>
+        <w:t xml:space="preserve"> funkcije za </w:t>
+      </w:r>
+      <w:r>
+        <w:rPr>
+          <w:i/>
+          <w:iCs/>
+          <w:lang w:val="en-US"/>
+        </w:rPr>
+        <w:t>XGBoost</w:t>
+      </w:r>
+      <w:r>
+        <w:rPr>
+          <w:lang w:val="en-US"/>
+        </w:rPr>
+        <w:t xml:space="preserve"> i </w:t>
+      </w:r>
+      <w:r>
+        <w:rPr>
+          <w:i/>
+          <w:iCs/>
+          <w:lang w:val="en-US"/>
+        </w:rPr>
+        <w:t>LightGBM</w:t>
+      </w:r>
+      <w:r>
+        <w:rPr>
+          <w:lang w:val="en-US"/>
+        </w:rPr>
+        <w:t xml:space="preserve"> na WR poziciji. Može se uočiti blagi </w:t>
+      </w:r>
+      <w:r>
+        <w:rPr>
+          <w:i/>
+          <w:iCs/>
+          <w:lang w:val="en-US"/>
+        </w:rPr>
+        <w:t>underfitting</w:t>
+      </w:r>
+      <w:r>
+        <w:rPr>
+          <w:lang w:val="en-US"/>
+        </w:rPr>
+        <w:t xml:space="preserve">, train i test krive su bliske jedna drugoj i obe nastavljaju da opadaju do kraja posmatranog broja etapa, bez jasnog minimuma test greške, što ukazuje da modeli nisu dostigli svoj optimalni kapacitet. </w:t>
       </w:r>
     </w:p>
     <w:p>
@@ -38317,27 +38108,14 @@
       <w:r>
         <w:t xml:space="preserve">Slika </w:t>
       </w:r>
-      <w:r>
-        <w:fldChar w:fldCharType="begin"/>
-      </w:r>
-      <w:r>
-        <w:instrText xml:space="preserve"> SEQ Slika \* ARABIC </w:instrText>
-      </w:r>
-      <w:r>
-        <w:fldChar w:fldCharType="separate"/>
-      </w:r>
-      <w:r>
-        <w:rPr>
-          <w:noProof/>
-        </w:rPr>
-        <w:t>9</w:t>
-      </w:r>
-      <w:r>
-        <w:rPr>
-          <w:noProof/>
-        </w:rPr>
-        <w:fldChar w:fldCharType="end"/>
-      </w:r>
+      <w:fldSimple w:instr=" SEQ Slika \* ARABIC ">
+        <w:r>
+          <w:rPr>
+            <w:noProof/>
+          </w:rPr>
+          <w:t>9</w:t>
+        </w:r>
+      </w:fldSimple>
       <w:bookmarkEnd w:id="31"/>
       <w:r>
         <w:t xml:space="preserve"> Vrednost loss funkcije kroz etape</w:t>
@@ -38348,7 +38126,17 @@
         <w:pStyle w:val="BodyText"/>
       </w:pPr>
       <w:r>
-        <w:t xml:space="preserve">Na osnovu ovog uvida, broj boosting etapa je povećan, a uvedeno je i early stopping kako bi se automatski detektovao optimalan trenutak zaustavljanja treninga. Rezultati su prikazani na </w:t>
+        <w:t xml:space="preserve">Na osnovu ovog uvida, broj boosting etapa je povećan, a uvedeno je i </w:t>
+      </w:r>
+      <w:r>
+        <w:rPr>
+          <w:i/>
+          <w:iCs/>
+        </w:rPr>
+        <w:t>early stopping</w:t>
+      </w:r>
+      <w:r>
+        <w:t xml:space="preserve"> kako bi se automatski detektovao optimalan trenutak zaustavljanja treninga. Rezultati su prikazani na </w:t>
       </w:r>
       <w:r>
         <w:fldChar w:fldCharType="begin"/>
@@ -38372,7 +38160,72 @@
         <w:fldChar w:fldCharType="end"/>
       </w:r>
       <w:r>
-        <w:t>. Može se uočiti da se loss funkcija stabilizovala veoma brzo nakon povećanja broja etapa, a vrednosti greške nisu se značajno promenile u odnosu na prethodni eksperiment. Ovo retroaktivno potvrđuje da je minimum loss funkcije bio blizu kraja prvog eksperimenta, te da inicijalni utisak underfittinga nije bio u potpunosti opravdan. Oba modela pokazuju solidnu konvergenciju uz minimalan gap između train i test greške, što potvrđuje dobru generalizaciju na neviđenim podacima.</w:t>
+        <w:t xml:space="preserve">. Može se uočiti da se </w:t>
+      </w:r>
+      <w:r>
+        <w:rPr>
+          <w:i/>
+          <w:iCs/>
+        </w:rPr>
+        <w:t>loss</w:t>
+      </w:r>
+      <w:r>
+        <w:t xml:space="preserve"> funkcija stabilizovala veoma brzo nakon povećanja broja etapa, a vrednosti greške nisu se značajno promenile u odnosu na prethodni eksperiment. Ovo retroaktivno potvrđuje da je minimum </w:t>
+      </w:r>
+      <w:r>
+        <w:rPr>
+          <w:i/>
+          <w:iCs/>
+        </w:rPr>
+        <w:t>loss</w:t>
+      </w:r>
+      <w:r>
+        <w:t xml:space="preserve"> funkcije bio blizu kraja prvog eksperimenta, te da inicijalni utisak </w:t>
+      </w:r>
+      <w:r>
+        <w:rPr>
+          <w:i/>
+          <w:iCs/>
+        </w:rPr>
+        <w:t>underfitting</w:t>
+      </w:r>
+      <w:r>
+        <w:rPr>
+          <w:i/>
+          <w:iCs/>
+          <w:lang w:val="en-US"/>
+        </w:rPr>
+        <w:t>-</w:t>
+      </w:r>
+      <w:r>
+        <w:rPr>
+          <w:i/>
+          <w:iCs/>
+        </w:rPr>
+        <w:t>a</w:t>
+      </w:r>
+      <w:r>
+        <w:t xml:space="preserve"> nije bio u potpunosti opravdan. Oba modela pokazuju solidnu konvergenciju uz minimalan </w:t>
+      </w:r>
+      <w:r>
+        <w:rPr>
+          <w:i/>
+          <w:iCs/>
+        </w:rPr>
+        <w:t>gap</w:t>
+      </w:r>
+      <w:r>
+        <w:t xml:space="preserve"> između </w:t>
+      </w:r>
+      <w:r>
+        <w:rPr>
+          <w:i/>
+          <w:iCs/>
+        </w:rPr>
+        <w:t>train</w:t>
+      </w:r>
+      <w:r>
+        <w:t xml:space="preserve"> i test greške, što potvrđuje dobru generalizaciju na neviđenim podacima.</w:t>
       </w:r>
     </w:p>
     <w:p>
@@ -38427,27 +38280,14 @@
       <w:r>
         <w:t xml:space="preserve">Slika </w:t>
       </w:r>
-      <w:r>
-        <w:fldChar w:fldCharType="begin"/>
-      </w:r>
-      <w:r>
-        <w:instrText xml:space="preserve"> SEQ Slika \* ARABIC </w:instrText>
-      </w:r>
-      <w:r>
-        <w:fldChar w:fldCharType="separate"/>
-      </w:r>
-      <w:r>
-        <w:rPr>
-          <w:noProof/>
-        </w:rPr>
-        <w:t>10</w:t>
-      </w:r>
-      <w:r>
-        <w:rPr>
-          <w:noProof/>
-        </w:rPr>
-        <w:fldChar w:fldCharType="end"/>
-      </w:r>
+      <w:fldSimple w:instr=" SEQ Slika \* ARABIC ">
+        <w:r>
+          <w:rPr>
+            <w:noProof/>
+          </w:rPr>
+          <w:t>10</w:t>
+        </w:r>
+      </w:fldSimple>
       <w:bookmarkEnd w:id="32"/>
       <w:r>
         <w:t xml:space="preserve"> Vrednost loss funkcije kroz etape nakon dupliranja broja epoha</w:t>
@@ -42092,27 +41932,14 @@
       <w:r>
         <w:t xml:space="preserve">Tabela </w:t>
       </w:r>
-      <w:r>
-        <w:fldChar w:fldCharType="begin"/>
-      </w:r>
-      <w:r>
-        <w:instrText xml:space="preserve"> SEQ Tabela \* ARABIC </w:instrText>
-      </w:r>
-      <w:r>
-        <w:fldChar w:fldCharType="separate"/>
-      </w:r>
-      <w:r>
-        <w:rPr>
-          <w:noProof/>
-        </w:rPr>
-        <w:t>22</w:t>
-      </w:r>
-      <w:r>
-        <w:rPr>
-          <w:noProof/>
-        </w:rPr>
-        <w:fldChar w:fldCharType="end"/>
-      </w:r>
+      <w:fldSimple w:instr=" SEQ Tabela \* ARABIC ">
+        <w:r>
+          <w:rPr>
+            <w:noProof/>
+          </w:rPr>
+          <w:t>22</w:t>
+        </w:r>
+      </w:fldSimple>
       <w:bookmarkEnd w:id="34"/>
       <w:r>
         <w:t xml:space="preserve"> Multi output rezultati za sve pozicije</w:t>

</xml_diff>